<commit_message>
Final completion report added
</commit_message>
<xml_diff>
--- a/Final_Project_Report.docx
+++ b/Final_Project_Report.docx
@@ -587,10 +587,7 @@
         <w:jc w:val="both"/>
       </w:pPr>
       <w:r>
-        <w:t>Build</w:t>
-      </w:r>
-      <w:r>
-        <w:t xml:space="preserve"> a fundamental equity classification model that predicts whether a stock will outperform (Investable) or underperform (</w:t>
+        <w:t>Build a fundamental equity classification model that predicts whether a stock will outperform (Investable) or underperform (</w:t>
       </w:r>
       <w:proofErr w:type="gramStart"/>
       <w:r>
@@ -1068,409 +1065,68 @@
         <w:t>Model Comparison</w:t>
       </w:r>
     </w:p>
-    <w:tbl>
-      <w:tblPr>
-        <w:tblStyle w:val="TableGrid"/>
-        <w:tblW w:w="0" w:type="auto"/>
-        <w:tblLook w:val="04A0" w:firstRow="1" w:lastRow="0" w:firstColumn="1" w:lastColumn="0" w:noHBand="0" w:noVBand="1"/>
-      </w:tblPr>
-      <w:tblGrid>
-        <w:gridCol w:w="1440"/>
-        <w:gridCol w:w="1440"/>
-        <w:gridCol w:w="1440"/>
-        <w:gridCol w:w="1440"/>
-        <w:gridCol w:w="1440"/>
-        <w:gridCol w:w="1440"/>
-      </w:tblGrid>
-      <w:tr>
-        <w:tc>
-          <w:tcPr>
-            <w:tcW w:w="1440" w:type="dxa"/>
-          </w:tcPr>
-          <w:p>
-            <w:r>
-              <w:t>Model</w:t>
-            </w:r>
-          </w:p>
-        </w:tc>
-        <w:tc>
-          <w:tcPr>
-            <w:tcW w:w="1440" w:type="dxa"/>
-          </w:tcPr>
-          <w:p>
-            <w:r>
-              <w:t>Accuracy</w:t>
-            </w:r>
-          </w:p>
-        </w:tc>
-        <w:tc>
-          <w:tcPr>
-            <w:tcW w:w="1440" w:type="dxa"/>
-          </w:tcPr>
-          <w:p>
-            <w:r>
-              <w:t>Precision</w:t>
-            </w:r>
-          </w:p>
-        </w:tc>
-        <w:tc>
-          <w:tcPr>
-            <w:tcW w:w="1440" w:type="dxa"/>
-          </w:tcPr>
-          <w:p>
-            <w:r>
-              <w:t>Recall</w:t>
-            </w:r>
-          </w:p>
-        </w:tc>
-        <w:tc>
-          <w:tcPr>
-            <w:tcW w:w="1440" w:type="dxa"/>
-          </w:tcPr>
-          <w:p>
-            <w:r>
-              <w:t>F1 Score</w:t>
-            </w:r>
-          </w:p>
-        </w:tc>
-        <w:tc>
-          <w:tcPr>
-            <w:tcW w:w="1440" w:type="dxa"/>
-          </w:tcPr>
-          <w:p>
-            <w:r>
-              <w:t>ROC-AUC</w:t>
-            </w:r>
-          </w:p>
-        </w:tc>
-      </w:tr>
-      <w:tr>
-        <w:tc>
-          <w:tcPr>
-            <w:tcW w:w="1440" w:type="dxa"/>
-          </w:tcPr>
-          <w:p>
-            <w:r>
-              <w:t>XGBoost</w:t>
-            </w:r>
-          </w:p>
-        </w:tc>
-        <w:tc>
-          <w:tcPr>
-            <w:tcW w:w="1440" w:type="dxa"/>
-          </w:tcPr>
-          <w:p>
-            <w:r>
-              <w:t>0.921</w:t>
-            </w:r>
-          </w:p>
-        </w:tc>
-        <w:tc>
-          <w:tcPr>
-            <w:tcW w:w="1440" w:type="dxa"/>
-          </w:tcPr>
-          <w:p>
-            <w:r>
-              <w:t>0.912</w:t>
-            </w:r>
-          </w:p>
-        </w:tc>
-        <w:tc>
-          <w:tcPr>
-            <w:tcW w:w="1440" w:type="dxa"/>
-          </w:tcPr>
-          <w:p>
-            <w:r>
-              <w:t>0.840</w:t>
-            </w:r>
-          </w:p>
-        </w:tc>
-        <w:tc>
-          <w:tcPr>
-            <w:tcW w:w="1440" w:type="dxa"/>
-          </w:tcPr>
-          <w:p>
-            <w:r>
-              <w:t>0.857</w:t>
-            </w:r>
-          </w:p>
-        </w:tc>
-        <w:tc>
-          <w:tcPr>
-            <w:tcW w:w="1440" w:type="dxa"/>
-          </w:tcPr>
-          <w:p>
-            <w:r>
-              <w:t>0.967</w:t>
-            </w:r>
-          </w:p>
-        </w:tc>
-      </w:tr>
-      <w:tr>
-        <w:tc>
-          <w:tcPr>
-            <w:tcW w:w="1440" w:type="dxa"/>
-          </w:tcPr>
-          <w:p>
-            <w:r>
-              <w:t>Random Forest</w:t>
-            </w:r>
-          </w:p>
-        </w:tc>
-        <w:tc>
-          <w:tcPr>
-            <w:tcW w:w="1440" w:type="dxa"/>
-          </w:tcPr>
-          <w:p>
-            <w:r>
-              <w:t>0.908</w:t>
-            </w:r>
-          </w:p>
-        </w:tc>
-        <w:tc>
-          <w:tcPr>
-            <w:tcW w:w="1440" w:type="dxa"/>
-          </w:tcPr>
-          <w:p>
-            <w:r>
-              <w:t>0.901</w:t>
-            </w:r>
-          </w:p>
-        </w:tc>
-        <w:tc>
-          <w:tcPr>
-            <w:tcW w:w="1440" w:type="dxa"/>
-          </w:tcPr>
-          <w:p>
-            <w:r>
-              <w:t>0.783</w:t>
-            </w:r>
-          </w:p>
-        </w:tc>
-        <w:tc>
-          <w:tcPr>
-            <w:tcW w:w="1440" w:type="dxa"/>
-          </w:tcPr>
-          <w:p>
-            <w:r>
-              <w:t>0.822</w:t>
-            </w:r>
-          </w:p>
-        </w:tc>
-        <w:tc>
-          <w:tcPr>
-            <w:tcW w:w="1440" w:type="dxa"/>
-          </w:tcPr>
-          <w:p>
-            <w:r>
-              <w:t>0.954</w:t>
-            </w:r>
-          </w:p>
-        </w:tc>
-      </w:tr>
-      <w:tr>
-        <w:tc>
-          <w:tcPr>
-            <w:tcW w:w="1440" w:type="dxa"/>
-          </w:tcPr>
-          <w:p>
-            <w:r>
-              <w:t>Logistic Regression</w:t>
-            </w:r>
-          </w:p>
-        </w:tc>
-        <w:tc>
-          <w:tcPr>
-            <w:tcW w:w="1440" w:type="dxa"/>
-          </w:tcPr>
-          <w:p>
-            <w:r>
-              <w:t>0.875</w:t>
-            </w:r>
-          </w:p>
-        </w:tc>
-        <w:tc>
-          <w:tcPr>
-            <w:tcW w:w="1440" w:type="dxa"/>
-          </w:tcPr>
-          <w:p>
-            <w:r>
-              <w:t>0.835</w:t>
-            </w:r>
-          </w:p>
-        </w:tc>
-        <w:tc>
-          <w:tcPr>
-            <w:tcW w:w="1440" w:type="dxa"/>
-          </w:tcPr>
-          <w:p>
-            <w:r>
-              <w:t>0.672</w:t>
-            </w:r>
-          </w:p>
-        </w:tc>
-        <w:tc>
-          <w:tcPr>
-            <w:tcW w:w="1440" w:type="dxa"/>
-          </w:tcPr>
-          <w:p>
-            <w:r>
-              <w:t>0.730</w:t>
-            </w:r>
-          </w:p>
-        </w:tc>
-        <w:tc>
-          <w:tcPr>
-            <w:tcW w:w="1440" w:type="dxa"/>
-          </w:tcPr>
-          <w:p>
-            <w:r>
-              <w:t>0.890</w:t>
-            </w:r>
-          </w:p>
-        </w:tc>
-      </w:tr>
-      <w:tr>
-        <w:tc>
-          <w:tcPr>
-            <w:tcW w:w="1440" w:type="dxa"/>
-          </w:tcPr>
-          <w:p>
-            <w:r>
-              <w:t>SVM</w:t>
-            </w:r>
-          </w:p>
-        </w:tc>
-        <w:tc>
-          <w:tcPr>
-            <w:tcW w:w="1440" w:type="dxa"/>
-          </w:tcPr>
-          <w:p>
-            <w:r>
-              <w:t>0.880</w:t>
-            </w:r>
-          </w:p>
-        </w:tc>
-        <w:tc>
-          <w:tcPr>
-            <w:tcW w:w="1440" w:type="dxa"/>
-          </w:tcPr>
-          <w:p>
-            <w:r>
-              <w:t>0.841</w:t>
-            </w:r>
-          </w:p>
-        </w:tc>
-        <w:tc>
-          <w:tcPr>
-            <w:tcW w:w="1440" w:type="dxa"/>
-          </w:tcPr>
-          <w:p>
-            <w:r>
-              <w:t>0.690</w:t>
-            </w:r>
-          </w:p>
-        </w:tc>
-        <w:tc>
-          <w:tcPr>
-            <w:tcW w:w="1440" w:type="dxa"/>
-          </w:tcPr>
-          <w:p>
-            <w:r>
-              <w:t>0.745</w:t>
-            </w:r>
-          </w:p>
-        </w:tc>
-        <w:tc>
-          <w:tcPr>
-            <w:tcW w:w="1440" w:type="dxa"/>
-          </w:tcPr>
-          <w:p>
-            <w:r>
-              <w:t>0.902</w:t>
-            </w:r>
-          </w:p>
-        </w:tc>
-      </w:tr>
-      <w:tr>
-        <w:tc>
-          <w:tcPr>
-            <w:tcW w:w="1440" w:type="dxa"/>
-          </w:tcPr>
-          <w:p>
-            <w:r>
-              <w:t>Decision Tree</w:t>
-            </w:r>
-          </w:p>
-        </w:tc>
-        <w:tc>
-          <w:tcPr>
-            <w:tcW w:w="1440" w:type="dxa"/>
-          </w:tcPr>
-          <w:p>
-            <w:r>
-              <w:t>0.842</w:t>
-            </w:r>
-          </w:p>
-        </w:tc>
-        <w:tc>
-          <w:tcPr>
-            <w:tcW w:w="1440" w:type="dxa"/>
-          </w:tcPr>
-          <w:p>
-            <w:r>
-              <w:t>0.742</w:t>
-            </w:r>
-          </w:p>
-        </w:tc>
-        <w:tc>
-          <w:tcPr>
-            <w:tcW w:w="1440" w:type="dxa"/>
-          </w:tcPr>
-          <w:p>
-            <w:r>
-              <w:t>0.710</w:t>
-            </w:r>
-          </w:p>
-        </w:tc>
-        <w:tc>
-          <w:tcPr>
-            <w:tcW w:w="1440" w:type="dxa"/>
-          </w:tcPr>
-          <w:p>
-            <w:r>
-              <w:t>0.725</w:t>
-            </w:r>
-          </w:p>
-        </w:tc>
-        <w:tc>
-          <w:tcPr>
-            <w:tcW w:w="1440" w:type="dxa"/>
-          </w:tcPr>
-          <w:p>
-            <w:r>
-              <w:t>0.795</w:t>
-            </w:r>
-          </w:p>
-        </w:tc>
-      </w:tr>
-    </w:tbl>
     <w:p>
       <w:pPr>
-        <w:pStyle w:val="Heading2"/>
-      </w:pPr>
-      <w:r>
-        <w:t xml:space="preserve">Model </w:t>
-      </w:r>
-      <w:r>
-        <w:t>Evaluation</w:t>
+        <w:jc w:val="center"/>
+      </w:pPr>
+      <w:r>
+        <w:rPr>
+          <w:noProof/>
+        </w:rPr>
+        <w:drawing>
+          <wp:inline distT="0" distB="0" distL="0" distR="0" wp14:anchorId="6EF786A8" wp14:editId="7A500578">
+            <wp:extent cx="5113463" cy="1874682"/>
+            <wp:effectExtent l="0" t="0" r="0" b="0"/>
+            <wp:docPr id="702108191" name="Picture 1"/>
+            <wp:cNvGraphicFramePr>
+              <a:graphicFrameLocks xmlns:a="http://schemas.openxmlformats.org/drawingml/2006/main" noChangeAspect="1"/>
+            </wp:cNvGraphicFramePr>
+            <a:graphic xmlns:a="http://schemas.openxmlformats.org/drawingml/2006/main">
+              <a:graphicData uri="http://schemas.openxmlformats.org/drawingml/2006/picture">
+                <pic:pic xmlns:pic="http://schemas.openxmlformats.org/drawingml/2006/picture">
+                  <pic:nvPicPr>
+                    <pic:cNvPr id="702108191" name="Picture 702108191"/>
+                    <pic:cNvPicPr/>
+                  </pic:nvPicPr>
+                  <pic:blipFill>
+                    <a:blip r:embed="rId10"/>
+                    <a:stretch>
+                      <a:fillRect/>
+                    </a:stretch>
+                  </pic:blipFill>
+                  <pic:spPr>
+                    <a:xfrm>
+                      <a:off x="0" y="0"/>
+                      <a:ext cx="5113463" cy="1874682"/>
+                    </a:xfrm>
+                    <a:prstGeom prst="rect">
+                      <a:avLst/>
+                    </a:prstGeom>
+                  </pic:spPr>
+                </pic:pic>
+              </a:graphicData>
+            </a:graphic>
+          </wp:inline>
+        </w:drawing>
       </w:r>
     </w:p>
     <w:p>
       <w:pPr>
+        <w:pStyle w:val="Heading2"/>
+      </w:pPr>
+      <w:r>
+        <w:lastRenderedPageBreak/>
+        <w:t>Model Evaluation</w:t>
+      </w:r>
+    </w:p>
+    <w:p>
+      <w:pPr>
         <w:jc w:val="center"/>
       </w:pPr>
       <w:r>
+        <w:rPr>
+          <w:noProof/>
+        </w:rPr>
         <w:drawing>
           <wp:inline distT="0" distB="0" distL="0" distR="0" wp14:anchorId="3FEC3EC1" wp14:editId="482134E0">
             <wp:extent cx="4800079" cy="1080654"/>
@@ -1487,7 +1143,7 @@
                     <pic:cNvPicPr/>
                   </pic:nvPicPr>
                   <pic:blipFill>
-                    <a:blip r:embed="rId10"/>
+                    <a:blip r:embed="rId11"/>
                     <a:stretch>
                       <a:fillRect/>
                     </a:stretch>
@@ -1516,20 +1172,7 @@
         <w:rPr>
           <w:i/>
         </w:rPr>
-        <w:lastRenderedPageBreak/>
-        <w:t xml:space="preserve">Figure </w:t>
-      </w:r>
-      <w:r>
-        <w:rPr>
-          <w:i/>
-        </w:rPr>
-        <w:t>3</w:t>
-      </w:r>
-      <w:r>
-        <w:rPr>
-          <w:i/>
-        </w:rPr>
-        <w:t>: Confusion matrix</w:t>
+        <w:t>Figure 3: Confusion matrix</w:t>
       </w:r>
     </w:p>
     <w:p>
@@ -1537,10 +1180,13 @@
         <w:jc w:val="center"/>
       </w:pPr>
       <w:r>
+        <w:rPr>
+          <w:noProof/>
+        </w:rPr>
         <w:drawing>
-          <wp:inline distT="0" distB="0" distL="0" distR="0" wp14:anchorId="54F4D583" wp14:editId="29699EEB">
-            <wp:extent cx="4572000" cy="3796772"/>
-            <wp:effectExtent l="0" t="0" r="0" b="0"/>
+          <wp:inline distT="0" distB="0" distL="0" distR="0" wp14:anchorId="54F4D583" wp14:editId="6C127781">
+            <wp:extent cx="4008120" cy="3328504"/>
+            <wp:effectExtent l="0" t="0" r="0" b="5715"/>
             <wp:docPr id="727115017" name="Picture 1"/>
             <wp:cNvGraphicFramePr>
               <a:graphicFrameLocks xmlns:a="http://schemas.openxmlformats.org/drawingml/2006/main" noChangeAspect="1"/>
@@ -1553,7 +1199,7 @@
                     <pic:cNvPicPr/>
                   </pic:nvPicPr>
                   <pic:blipFill>
-                    <a:blip r:embed="rId11"/>
+                    <a:blip r:embed="rId12"/>
                     <a:stretch>
                       <a:fillRect/>
                     </a:stretch>
@@ -1561,7 +1207,7 @@
                   <pic:spPr>
                     <a:xfrm>
                       <a:off x="0" y="0"/>
-                      <a:ext cx="4583904" cy="3806658"/>
+                      <a:ext cx="4026295" cy="3343597"/>
                     </a:xfrm>
                     <a:prstGeom prst="rect">
                       <a:avLst/>
@@ -1688,6 +1334,49 @@
       </w:r>
     </w:p>
     <w:p>
+      <w:pPr>
+        <w:jc w:val="center"/>
+      </w:pPr>
+      <w:r>
+        <w:lastRenderedPageBreak/>
+        <w:drawing>
+          <wp:inline distT="0" distB="0" distL="0" distR="0" wp14:anchorId="7DEE9469" wp14:editId="44C077F4">
+            <wp:extent cx="4381880" cy="1577477"/>
+            <wp:effectExtent l="0" t="0" r="0" b="3810"/>
+            <wp:docPr id="1703722576" name="Picture 1"/>
+            <wp:cNvGraphicFramePr>
+              <a:graphicFrameLocks xmlns:a="http://schemas.openxmlformats.org/drawingml/2006/main" noChangeAspect="1"/>
+            </wp:cNvGraphicFramePr>
+            <a:graphic xmlns:a="http://schemas.openxmlformats.org/drawingml/2006/main">
+              <a:graphicData uri="http://schemas.openxmlformats.org/drawingml/2006/picture">
+                <pic:pic xmlns:pic="http://schemas.openxmlformats.org/drawingml/2006/picture">
+                  <pic:nvPicPr>
+                    <pic:cNvPr id="1703722576" name=""/>
+                    <pic:cNvPicPr/>
+                  </pic:nvPicPr>
+                  <pic:blipFill>
+                    <a:blip r:embed="rId13"/>
+                    <a:stretch>
+                      <a:fillRect/>
+                    </a:stretch>
+                  </pic:blipFill>
+                  <pic:spPr>
+                    <a:xfrm>
+                      <a:off x="0" y="0"/>
+                      <a:ext cx="4381880" cy="1577477"/>
+                    </a:xfrm>
+                    <a:prstGeom prst="rect">
+                      <a:avLst/>
+                    </a:prstGeom>
+                  </pic:spPr>
+                </pic:pic>
+              </a:graphicData>
+            </a:graphic>
+          </wp:inline>
+        </w:drawing>
+      </w:r>
+    </w:p>
+    <w:p>
       <w:r>
         <w:rPr>
           <w:b/>
@@ -1696,7 +1385,48 @@
         <w:t>Final Evaluation Metrics</w:t>
       </w:r>
       <w:r>
-        <w:t>: On the unseen test set, the tuned model maintained strong performance with 91% Accuracy, 82% Precision, 84% Recall, and an F1 Score of 83%. This conservative tuning aligns perfectly with the goal of reducing incorrect investment recommendations.</w:t>
+        <w:t>: On the unseen test set, the tuned model maintained strong performance with 91% Accuracy, 8</w:t>
+      </w:r>
+      <w:r>
+        <w:t>8</w:t>
+      </w:r>
+      <w:r>
+        <w:t>%</w:t>
+      </w:r>
+      <w:r>
+        <w:t xml:space="preserve"> macro avg</w:t>
+      </w:r>
+      <w:r>
+        <w:t xml:space="preserve"> Precision, 8</w:t>
+      </w:r>
+      <w:r>
+        <w:t>8</w:t>
+      </w:r>
+      <w:r>
+        <w:t xml:space="preserve">% </w:t>
+      </w:r>
+      <w:r>
+        <w:t xml:space="preserve">macro avg </w:t>
+      </w:r>
+      <w:r>
+        <w:t xml:space="preserve">Recall, and </w:t>
+      </w:r>
+      <w:proofErr w:type="gramStart"/>
+      <w:r>
+        <w:t>an</w:t>
+      </w:r>
+      <w:proofErr w:type="gramEnd"/>
+      <w:r>
+        <w:t xml:space="preserve"> macro avg</w:t>
+      </w:r>
+      <w:r>
+        <w:t xml:space="preserve"> F1 Score of 8</w:t>
+      </w:r>
+      <w:r>
+        <w:t>8</w:t>
+      </w:r>
+      <w:r>
+        <w:t>%. This conservative tuning aligns perfectly with the goal of reducing incorrect investment recommendations.</w:t>
       </w:r>
     </w:p>
     <w:p>
@@ -1704,7 +1434,6 @@
         <w:pStyle w:val="Heading1"/>
       </w:pPr>
       <w:r>
-        <w:lastRenderedPageBreak/>
         <w:t>7. Feature Importance</w:t>
       </w:r>
     </w:p>
@@ -1732,7 +1461,7 @@
                     <pic:cNvPicPr/>
                   </pic:nvPicPr>
                   <pic:blipFill>
-                    <a:blip r:embed="rId12"/>
+                    <a:blip r:embed="rId14"/>
                     <a:stretch>
                       <a:fillRect/>
                     </a:stretch>
@@ -1858,7 +1587,14 @@
         <w:rPr>
           <w:lang w:val="en-IN"/>
         </w:rPr>
-        <w:t xml:space="preserve">. This indicates that companies generating higher returns from shareholder capital and business assets are more likely to be classified as investable. </w:t>
+        <w:t xml:space="preserve">. This indicates that </w:t>
+      </w:r>
+      <w:r>
+        <w:rPr>
+          <w:lang w:val="en-IN"/>
+        </w:rPr>
+        <w:lastRenderedPageBreak/>
+        <w:t xml:space="preserve">companies generating higher returns from shareholder capital and business assets are more likely to be classified as investable. </w:t>
       </w:r>
     </w:p>
     <w:p>
@@ -1987,15 +1723,7 @@
           <w:bCs/>
           <w:lang w:val="en-IN"/>
         </w:rPr>
-        <w:t>industry</w:t>
-      </w:r>
-      <w:r>
-        <w:rPr>
-          <w:b/>
-          <w:bCs/>
-          <w:lang w:val="en-IN"/>
-        </w:rPr>
-        <w:t xml:space="preserve"> group</w:t>
+        <w:t>industry group</w:t>
       </w:r>
       <w:r>
         <w:rPr>
@@ -2059,7 +1787,6 @@
         <w:pStyle w:val="Heading1"/>
       </w:pPr>
       <w:r>
-        <w:lastRenderedPageBreak/>
         <w:t xml:space="preserve">9. </w:t>
       </w:r>
       <w:proofErr w:type="gramStart"/>
@@ -2469,6 +2196,7 @@
         <w:rPr>
           <w:lang w:val="en-IN"/>
         </w:rPr>
+        <w:lastRenderedPageBreak/>
         <w:t xml:space="preserve">The dataset represents a </w:t>
       </w:r>
       <w:r>
@@ -2648,7 +2376,7 @@
       </w:r>
     </w:p>
     <w:sectPr>
-      <w:footerReference w:type="default" r:id="rId13"/>
+      <w:footerReference w:type="default" r:id="rId15"/>
       <w:pgSz w:w="12240" w:h="15840"/>
       <w:pgMar w:top="1440" w:right="1800" w:bottom="1440" w:left="1800" w:header="720" w:footer="720" w:gutter="0"/>
       <w:cols w:space="720"/>
@@ -4326,6 +4054,7 @@
   <w:style w:type="character" w:default="1" w:styleId="DefaultParagraphFont">
     <w:name w:val="Default Paragraph Font"/>
     <w:uiPriority w:val="1"/>
+    <w:semiHidden/>
     <w:unhideWhenUsed/>
   </w:style>
   <w:style w:type="table" w:default="1" w:styleId="TableNormal">

</xml_diff>